<commit_message>
add mission statement & minor other changes
</commit_message>
<xml_diff>
--- a/Documentation/Projektauftrag.docx
+++ b/Documentation/Projektauftrag.docx
@@ -333,69 +333,48 @@
         <w:rPr>
           <w:lang w:val="de-DE"/>
         </w:rPr>
+        <w:lastRenderedPageBreak/>
         <w:t>Projektziel</w:t>
       </w:r>
     </w:p>
     <w:p>
       <w:pPr>
-        <w:pStyle w:val="Textkrper"/>
-      </w:pPr>
-      <w:r>
-        <w:t>Die Anwendung soll es Benutzern ermöglichen:</w:t>
-      </w:r>
-    </w:p>
-    <w:p>
-      <w:pPr>
-        <w:pStyle w:val="Textkrper"/>
-        <w:numPr>
-          <w:ilvl w:val="0"/>
-          <w:numId w:val="3"/>
-        </w:numPr>
-        <w:tabs>
-          <w:tab w:val="clear" w:pos="709"/>
-          <w:tab w:val="left" w:pos="0"/>
-        </w:tabs>
-      </w:pPr>
-      <w:r>
-        <w:t>Eigene Karteikarten zu erstellen, bearbeiten und organisieren</w:t>
-      </w:r>
-    </w:p>
-    <w:p>
-      <w:pPr>
-        <w:pStyle w:val="Textkrper"/>
-        <w:numPr>
-          <w:ilvl w:val="0"/>
-          <w:numId w:val="3"/>
-        </w:numPr>
-        <w:tabs>
-          <w:tab w:val="clear" w:pos="709"/>
-          <w:tab w:val="left" w:pos="0"/>
-        </w:tabs>
-      </w:pPr>
+        <w:pStyle w:val="berschrift1"/>
+        <w:rPr>
+          <w:rFonts w:asciiTheme="minorHAnsi" w:eastAsiaTheme="minorHAnsi" w:hAnsiTheme="minorHAnsi" w:cstheme="minorBidi"/>
+          <w:color w:val="auto"/>
+          <w:sz w:val="22"/>
+          <w:szCs w:val="22"/>
+        </w:rPr>
+      </w:pPr>
+      <w:r>
+        <w:rPr>
+          <w:rFonts w:asciiTheme="minorHAnsi" w:eastAsiaTheme="minorHAnsi" w:hAnsiTheme="minorHAnsi" w:cstheme="minorBidi"/>
+          <w:color w:val="auto"/>
+          <w:sz w:val="22"/>
+          <w:szCs w:val="22"/>
+        </w:rPr>
+        <w:t xml:space="preserve">Ziel des Projekts ist die Entwicklung einer Webapplikation für ein digitales Karteikarten-System. Benutzer sollen eigene Karteikarten erstellen, bearbeiten, löschen und in </w:t>
+      </w:r>
       <w:proofErr w:type="spellStart"/>
       <w:r>
-        <w:lastRenderedPageBreak/>
+        <w:rPr>
+          <w:rFonts w:asciiTheme="minorHAnsi" w:eastAsiaTheme="minorHAnsi" w:hAnsiTheme="minorHAnsi" w:cstheme="minorBidi"/>
+          <w:color w:val="auto"/>
+          <w:sz w:val="22"/>
+          <w:szCs w:val="22"/>
+        </w:rPr>
         <w:t>Lernsets</w:t>
       </w:r>
       <w:proofErr w:type="spellEnd"/>
       <w:r>
-        <w:t xml:space="preserve"> zu verwalten</w:t>
-      </w:r>
-    </w:p>
-    <w:p>
-      <w:pPr>
-        <w:pStyle w:val="Textkrper"/>
-        <w:numPr>
-          <w:ilvl w:val="0"/>
-          <w:numId w:val="3"/>
-        </w:numPr>
-        <w:tabs>
-          <w:tab w:val="clear" w:pos="709"/>
-          <w:tab w:val="left" w:pos="0"/>
-        </w:tabs>
-      </w:pPr>
-      <w:r>
-        <w:t>Inhalte effizient zu wiederholen, auch mit Hilfe eines intelligenten Wiederholungssystem.</w:t>
+        <w:rPr>
+          <w:rFonts w:asciiTheme="minorHAnsi" w:eastAsiaTheme="minorHAnsi" w:hAnsiTheme="minorHAnsi" w:cstheme="minorBidi"/>
+          <w:color w:val="auto"/>
+          <w:sz w:val="22"/>
+          <w:szCs w:val="22"/>
+        </w:rPr>
+        <w:t xml:space="preserve"> organisieren können. Die Anwendung soll ausserdem ein Wiederholungssystem bieten, das Benutzer beim Lernen unterstützt. Die Website wird mit modernen Webtechnologien umgesetzt und über einen Webbrowser nutzbar sein. Das Projekt gilt als erfolgreich, wenn die wichtigsten Funktionen umgesetzt sind und die Anwendung zum Lernen verwendet werden kann. Die Fertigstellung des Projekts ist bis zum 25. Juni 2026 geplant.</w:t>
       </w:r>
     </w:p>
     <w:p>
@@ -683,6 +662,7 @@
     </w:p>
     <w:p>
       <w:r>
+        <w:lastRenderedPageBreak/>
         <w:t>Egor Biriukov</w:t>
       </w:r>
     </w:p>
@@ -697,7 +677,6 @@
         <w:rPr>
           <w:lang w:val="de-DE"/>
         </w:rPr>
-        <w:lastRenderedPageBreak/>
         <w:t>Kommunikationsplan</w:t>
       </w:r>
     </w:p>
@@ -742,26 +721,41 @@
       </w:r>
     </w:p>
     <w:p>
-      <w:pPr>
-        <w:rPr>
-          <w:lang w:val="de-DE"/>
-        </w:rPr>
-      </w:pPr>
-      <w:r>
-        <w:t>Das Projekt wird in mehrere Phasen unterteilt, darunter Planung und Vorbereitung, Feature-Definition, Datenmodellierung sowie Umsetzung der Webapplikation. Wichtige Meilensteine sind die Definition der Ziele, Erstellung der Use-Cases, Modellierung der Datenbank (ER-Diagramm) und die Implementierung der Anwendung. Das Projekt wird von Egor</w:t>
-      </w:r>
-      <w:r>
-        <w:t xml:space="preserve">, </w:t>
-      </w:r>
-      <w:r>
-        <w:t>Sanjivan</w:t>
-      </w:r>
-      <w:r>
-        <w:t>, Gian und Liam</w:t>
-      </w:r>
-      <w:r>
-        <w:t xml:space="preserve"> umgesetzt, die Ressourcen werden auf die einzelnen Projektphasen verteilt; das Projekt läuft bis zum 25. Juni 2026 und benötigt kein separates Budget, da nur bestehende Entwicklungswerkzeuge verwendet werden.</w:t>
-      </w:r>
+      <w:r>
+        <w:t xml:space="preserve">Das Projekt wird in mehrere Phasen unterteilt, darunter Planung und Vorbereitung, Feature-Definition, Datenmodellierung sowie Umsetzung der Webapplikation. Wichtige Meilensteine sind die Definition der Projektziele, Erstellung der Use-Cases, Modellierung der Datenbank (ER-Diagramm) und die Implementierung der wichtigsten Funktionen. Das Projekt wird von Sanjivan Selvarasa, Gian Gaudenz, Liam Bruno und Egor Biriukov umgesetzt, wobei die Aufgaben auf Frontend, Backend, Datenbank und Projektleitung verteilt sind. Schnittstellen zu anderen Projekten bestehen nicht, da das Projekt unabhängig im Rahmen des Moduls 306 durchgeführt wird. Das Projekt nutzt bestehende Technologien wie Vue, SQL und Docker und benötigt kein separates Budget. Die Umsetzung </w:t>
+      </w:r>
+      <w:r>
+        <w:t>ist</w:t>
+      </w:r>
+      <w:r>
+        <w:t xml:space="preserve"> während des Semesters und soll bis </w:t>
+      </w:r>
+      <w:r>
+        <w:t>am</w:t>
+      </w:r>
+      <w:r>
+        <w:t xml:space="preserve"> 25. Juni 2026 abgeschlossen sein.</w:t>
+      </w:r>
+    </w:p>
+    <w:p>
+      <w:pPr>
+        <w:pStyle w:val="berschrift1"/>
+      </w:pPr>
+      <w:r>
+        <w:t>Mission Statement</w:t>
+      </w:r>
+    </w:p>
+    <w:p>
+      <w:r>
+        <w:t>Unser Projekt entwickelt eine Webapplikation für digitale Karteikarten. Die Anwendung soll Lernenden helfen, Inhalte effizient zu wiederholen und ihren Lernprozess besser zu organisieren. Ziel ist es, ein einfaches und benutzerfreundliches Lernwerkzeug bereitzustellen.</w:t>
+      </w:r>
+    </w:p>
+    <w:p>
+      <w:pPr>
+        <w:rPr>
+          <w:lang w:val="de-DE"/>
+        </w:rPr>
+      </w:pPr>
     </w:p>
     <w:sectPr>
       <w:pgSz w:w="11906" w:h="16838"/>

</xml_diff>

<commit_message>
remove Mission Statement File
</commit_message>
<xml_diff>
--- a/Documentation/Projektauftrag.docx
+++ b/Documentation/Projektauftrag.docx
@@ -374,7 +374,47 @@
           <w:sz w:val="22"/>
           <w:szCs w:val="22"/>
         </w:rPr>
-        <w:t xml:space="preserve"> organisieren können. Die Anwendung soll ausserdem ein Wiederholungssystem bieten, das Benutzer beim Lernen unterstützt. Die Website wird mit modernen Webtechnologien umgesetzt und über einen Webbrowser nutzbar sein. Das Projekt gilt als erfolgreich, wenn die wichtigsten Funktionen umgesetzt sind und die Anwendung zum Lernen verwendet werden kann. Die Fertigstellung des Projekts ist bis zum 25. Juni 2026 geplant.</w:t>
+        <w:t xml:space="preserve"> organisieren können. Die Anwendung soll ausserdem ein Wiederholungssystem bieten, das Benutzer beim Lernen unterstützt. Die Website wird mit modernen Webtechnologien umgesetzt und über einen Webbrowser nutzbar sein. Das Projekt </w:t>
+      </w:r>
+      <w:proofErr w:type="gramStart"/>
+      <w:r>
+        <w:rPr>
+          <w:rFonts w:asciiTheme="minorHAnsi" w:eastAsiaTheme="minorHAnsi" w:hAnsiTheme="minorHAnsi" w:cstheme="minorBidi"/>
+          <w:color w:val="auto"/>
+          <w:sz w:val="22"/>
+          <w:szCs w:val="22"/>
+        </w:rPr>
+        <w:t>gilt</w:t>
+      </w:r>
+      <w:proofErr w:type="gramEnd"/>
+      <w:r>
+        <w:rPr>
+          <w:rFonts w:asciiTheme="minorHAnsi" w:eastAsiaTheme="minorHAnsi" w:hAnsiTheme="minorHAnsi" w:cstheme="minorBidi"/>
+          <w:color w:val="auto"/>
+          <w:sz w:val="22"/>
+          <w:szCs w:val="22"/>
+        </w:rPr>
+        <w:t xml:space="preserve"> als erfolgreich, wenn die wichtigsten Funktionen umgesetzt sind und die Anwendung zum Lernen </w:t>
+      </w:r>
+      <w:proofErr w:type="gramStart"/>
+      <w:r>
+        <w:rPr>
+          <w:rFonts w:asciiTheme="minorHAnsi" w:eastAsiaTheme="minorHAnsi" w:hAnsiTheme="minorHAnsi" w:cstheme="minorBidi"/>
+          <w:color w:val="auto"/>
+          <w:sz w:val="22"/>
+          <w:szCs w:val="22"/>
+        </w:rPr>
+        <w:t>verwendet</w:t>
+      </w:r>
+      <w:proofErr w:type="gramEnd"/>
+      <w:r>
+        <w:rPr>
+          <w:rFonts w:asciiTheme="minorHAnsi" w:eastAsiaTheme="minorHAnsi" w:hAnsiTheme="minorHAnsi" w:cstheme="minorBidi"/>
+          <w:color w:val="auto"/>
+          <w:sz w:val="22"/>
+          <w:szCs w:val="22"/>
+        </w:rPr>
+        <w:t xml:space="preserve"> werden kann. Die Fertigstellung des Projekts ist bis zum 25. Juni 2026 geplant.</w:t>
       </w:r>
     </w:p>
     <w:p>
@@ -758,6 +798,7 @@
       </w:pPr>
     </w:p>
     <w:sectPr>
+      <w:headerReference w:type="default" r:id="rId7"/>
       <w:pgSz w:w="11906" w:h="16838"/>
       <w:pgMar w:top="1417" w:right="1417" w:bottom="1134" w:left="1417" w:header="0" w:footer="0" w:gutter="0"/>
       <w:cols w:space="720"/>
@@ -766,6 +807,83 @@
     </w:sectPr>
   </w:body>
 </w:document>
+</file>
+
+<file path=word/endnotes.xml><?xml version="1.0" encoding="utf-8"?>
+<w:endnotes xmlns:wpc="http://schemas.microsoft.com/office/word/2010/wordprocessingCanvas" xmlns:cx="http://schemas.microsoft.com/office/drawing/2014/chartex" xmlns:cx1="http://schemas.microsoft.com/office/drawing/2015/9/8/chartex" xmlns:cx2="http://schemas.microsoft.com/office/drawing/2015/10/21/chartex" xmlns:cx3="http://schemas.microsoft.com/office/drawing/2016/5/9/chartex" xmlns:cx4="http://schemas.microsoft.com/office/drawing/2016/5/10/chartex" xmlns:cx5="http://schemas.microsoft.com/office/drawing/2016/5/11/chartex" xmlns:cx6="http://schemas.microsoft.com/office/drawing/2016/5/12/chartex" xmlns:cx7="http://schemas.microsoft.com/office/drawing/2016/5/13/chartex" xmlns:cx8="http://schemas.microsoft.com/office/drawing/2016/5/14/chartex" xmlns:mc="http://schemas.openxmlformats.org/markup-compatibility/2006" xmlns:aink="http://schemas.microsoft.com/office/drawing/2016/ink" xmlns:am3d="http://schemas.microsoft.com/office/drawing/2017/model3d" xmlns:o="urn:schemas-microsoft-com:office:office" xmlns:oel="http://schemas.microsoft.com/office/2019/extlst" xmlns:r="http://schemas.openxmlformats.org/officeDocument/2006/relationships" xmlns:m="http://schemas.openxmlformats.org/officeDocument/2006/math" xmlns:v="urn:schemas-microsoft-com:vml" xmlns:wp14="http://schemas.microsoft.com/office/word/2010/wordprocessingDrawing" xmlns:wp="http://schemas.openxmlformats.org/drawingml/2006/wordprocessingDrawing" xmlns:w10="urn:schemas-microsoft-com:office:word" xmlns:w="http://schemas.openxmlformats.org/wordprocessingml/2006/main" xmlns:w14="http://schemas.microsoft.com/office/word/2010/wordml" xmlns:w15="http://schemas.microsoft.com/office/word/2012/wordml" xmlns:w16cex="http://schemas.microsoft.com/office/word/2018/wordml/cex" xmlns:w16cid="http://schemas.microsoft.com/office/word/2016/wordml/cid" xmlns:w16="http://schemas.microsoft.com/office/word/2018/wordml" xmlns:w16du="http://schemas.microsoft.com/office/word/2023/wordml/word16du" xmlns:w16sdtdh="http://schemas.microsoft.com/office/word/2020/wordml/sdtdatahash" xmlns:w16sdtfl="http://schemas.microsoft.com/office/word/2024/wordml/sdtformatlock" xmlns:w16se="http://schemas.microsoft.com/office/word/2015/wordml/symex" xmlns:wpg="http://schemas.microsoft.com/office/word/2010/wordprocessingGroup" xmlns:wpi="http://schemas.microsoft.com/office/word/2010/wordprocessingInk" xmlns:wne="http://schemas.microsoft.com/office/word/2006/wordml" xmlns:wps="http://schemas.microsoft.com/office/word/2010/wordprocessingShape" mc:Ignorable="w14 w15 w16se w16cid w16 w16cex w16sdtdh w16sdtfl w16du wp14">
+  <w:endnote w:type="separator" w:id="-1">
+    <w:p>
+      <w:pPr>
+        <w:spacing w:after="0" w:line="240" w:lineRule="auto"/>
+      </w:pPr>
+      <w:r>
+        <w:separator/>
+      </w:r>
+    </w:p>
+  </w:endnote>
+  <w:endnote w:type="continuationSeparator" w:id="0">
+    <w:p>
+      <w:pPr>
+        <w:spacing w:after="0" w:line="240" w:lineRule="auto"/>
+      </w:pPr>
+      <w:r>
+        <w:continuationSeparator/>
+      </w:r>
+    </w:p>
+  </w:endnote>
+</w:endnotes>
+</file>
+
+<file path=word/footnotes.xml><?xml version="1.0" encoding="utf-8"?>
+<w:footnotes xmlns:wpc="http://schemas.microsoft.com/office/word/2010/wordprocessingCanvas" xmlns:cx="http://schemas.microsoft.com/office/drawing/2014/chartex" xmlns:cx1="http://schemas.microsoft.com/office/drawing/2015/9/8/chartex" xmlns:cx2="http://schemas.microsoft.com/office/drawing/2015/10/21/chartex" xmlns:cx3="http://schemas.microsoft.com/office/drawing/2016/5/9/chartex" xmlns:cx4="http://schemas.microsoft.com/office/drawing/2016/5/10/chartex" xmlns:cx5="http://schemas.microsoft.com/office/drawing/2016/5/11/chartex" xmlns:cx6="http://schemas.microsoft.com/office/drawing/2016/5/12/chartex" xmlns:cx7="http://schemas.microsoft.com/office/drawing/2016/5/13/chartex" xmlns:cx8="http://schemas.microsoft.com/office/drawing/2016/5/14/chartex" xmlns:mc="http://schemas.openxmlformats.org/markup-compatibility/2006" xmlns:aink="http://schemas.microsoft.com/office/drawing/2016/ink" xmlns:am3d="http://schemas.microsoft.com/office/drawing/2017/model3d" xmlns:o="urn:schemas-microsoft-com:office:office" xmlns:oel="http://schemas.microsoft.com/office/2019/extlst" xmlns:r="http://schemas.openxmlformats.org/officeDocument/2006/relationships" xmlns:m="http://schemas.openxmlformats.org/officeDocument/2006/math" xmlns:v="urn:schemas-microsoft-com:vml" xmlns:wp14="http://schemas.microsoft.com/office/word/2010/wordprocessingDrawing" xmlns:wp="http://schemas.openxmlformats.org/drawingml/2006/wordprocessingDrawing" xmlns:w10="urn:schemas-microsoft-com:office:word" xmlns:w="http://schemas.openxmlformats.org/wordprocessingml/2006/main" xmlns:w14="http://schemas.microsoft.com/office/word/2010/wordml" xmlns:w15="http://schemas.microsoft.com/office/word/2012/wordml" xmlns:w16cex="http://schemas.microsoft.com/office/word/2018/wordml/cex" xmlns:w16cid="http://schemas.microsoft.com/office/word/2016/wordml/cid" xmlns:w16="http://schemas.microsoft.com/office/word/2018/wordml" xmlns:w16du="http://schemas.microsoft.com/office/word/2023/wordml/word16du" xmlns:w16sdtdh="http://schemas.microsoft.com/office/word/2020/wordml/sdtdatahash" xmlns:w16sdtfl="http://schemas.microsoft.com/office/word/2024/wordml/sdtformatlock" xmlns:w16se="http://schemas.microsoft.com/office/word/2015/wordml/symex" xmlns:wpg="http://schemas.microsoft.com/office/word/2010/wordprocessingGroup" xmlns:wpi="http://schemas.microsoft.com/office/word/2010/wordprocessingInk" xmlns:wne="http://schemas.microsoft.com/office/word/2006/wordml" xmlns:wps="http://schemas.microsoft.com/office/word/2010/wordprocessingShape" mc:Ignorable="w14 w15 w16se w16cid w16 w16cex w16sdtdh w16sdtfl w16du wp14">
+  <w:footnote w:type="separator" w:id="-1">
+    <w:p>
+      <w:pPr>
+        <w:spacing w:after="0" w:line="240" w:lineRule="auto"/>
+      </w:pPr>
+      <w:r>
+        <w:separator/>
+      </w:r>
+    </w:p>
+  </w:footnote>
+  <w:footnote w:type="continuationSeparator" w:id="0">
+    <w:p>
+      <w:pPr>
+        <w:spacing w:after="0" w:line="240" w:lineRule="auto"/>
+      </w:pPr>
+      <w:r>
+        <w:continuationSeparator/>
+      </w:r>
+    </w:p>
+  </w:footnote>
+</w:footnotes>
+</file>
+
+<file path=word/header1.xml><?xml version="1.0" encoding="utf-8"?>
+<w:hdr xmlns:wpc="http://schemas.microsoft.com/office/word/2010/wordprocessingCanvas" xmlns:cx="http://schemas.microsoft.com/office/drawing/2014/chartex" xmlns:cx1="http://schemas.microsoft.com/office/drawing/2015/9/8/chartex" xmlns:cx2="http://schemas.microsoft.com/office/drawing/2015/10/21/chartex" xmlns:cx3="http://schemas.microsoft.com/office/drawing/2016/5/9/chartex" xmlns:cx4="http://schemas.microsoft.com/office/drawing/2016/5/10/chartex" xmlns:cx5="http://schemas.microsoft.com/office/drawing/2016/5/11/chartex" xmlns:cx6="http://schemas.microsoft.com/office/drawing/2016/5/12/chartex" xmlns:cx7="http://schemas.microsoft.com/office/drawing/2016/5/13/chartex" xmlns:cx8="http://schemas.microsoft.com/office/drawing/2016/5/14/chartex" xmlns:mc="http://schemas.openxmlformats.org/markup-compatibility/2006" xmlns:aink="http://schemas.microsoft.com/office/drawing/2016/ink" xmlns:am3d="http://schemas.microsoft.com/office/drawing/2017/model3d" xmlns:o="urn:schemas-microsoft-com:office:office" xmlns:oel="http://schemas.microsoft.com/office/2019/extlst" xmlns:r="http://schemas.openxmlformats.org/officeDocument/2006/relationships" xmlns:m="http://schemas.openxmlformats.org/officeDocument/2006/math" xmlns:v="urn:schemas-microsoft-com:vml" xmlns:wp14="http://schemas.microsoft.com/office/word/2010/wordprocessingDrawing" xmlns:wp="http://schemas.openxmlformats.org/drawingml/2006/wordprocessingDrawing" xmlns:w10="urn:schemas-microsoft-com:office:word" xmlns:w="http://schemas.openxmlformats.org/wordprocessingml/2006/main" xmlns:w14="http://schemas.microsoft.com/office/word/2010/wordml" xmlns:w15="http://schemas.microsoft.com/office/word/2012/wordml" xmlns:w16cex="http://schemas.microsoft.com/office/word/2018/wordml/cex" xmlns:w16cid="http://schemas.microsoft.com/office/word/2016/wordml/cid" xmlns:w16="http://schemas.microsoft.com/office/word/2018/wordml" xmlns:w16du="http://schemas.microsoft.com/office/word/2023/wordml/word16du" xmlns:w16sdtdh="http://schemas.microsoft.com/office/word/2020/wordml/sdtdatahash" xmlns:w16sdtfl="http://schemas.microsoft.com/office/word/2024/wordml/sdtformatlock" xmlns:w16se="http://schemas.microsoft.com/office/word/2015/wordml/symex" xmlns:wpg="http://schemas.microsoft.com/office/word/2010/wordprocessingGroup" xmlns:wpi="http://schemas.microsoft.com/office/word/2010/wordprocessingInk" xmlns:wne="http://schemas.microsoft.com/office/word/2006/wordml" xmlns:wps="http://schemas.microsoft.com/office/word/2010/wordprocessingShape" mc:Ignorable="w14 w15 w16se w16cid w16 w16cex w16sdtdh w16sdtfl w16du wp14">
+  <w:p>
+    <w:pPr>
+      <w:pStyle w:val="Kopfzeile"/>
+      <w:rPr>
+        <w:lang w:val="de-DE"/>
+      </w:rPr>
+    </w:pPr>
+  </w:p>
+  <w:p>
+    <w:pPr>
+      <w:pStyle w:val="Kopfzeile"/>
+      <w:rPr>
+        <w:lang w:val="de-DE"/>
+      </w:rPr>
+    </w:pPr>
+    <w:r>
+      <w:rPr>
+        <w:lang w:val="de-DE"/>
+      </w:rPr>
+      <w:t>Sanjivan, Egor, Gian, Liam</w:t>
+    </w:r>
+  </w:p>
+</w:hdr>
 </file>
 
 <file path=word/numbering.xml><?xml version="1.0" encoding="utf-8"?>
@@ -2325,6 +2443,50 @@
       <w:color w:val="0F4761" w:themeColor="accent1" w:themeShade="BF"/>
     </w:rPr>
   </w:style>
+  <w:style w:type="paragraph" w:styleId="Kopfzeile">
+    <w:name w:val="header"/>
+    <w:basedOn w:val="Standard"/>
+    <w:link w:val="KopfzeileZchn"/>
+    <w:uiPriority w:val="99"/>
+    <w:unhideWhenUsed/>
+    <w:rsid w:val="00E93E20"/>
+    <w:pPr>
+      <w:tabs>
+        <w:tab w:val="center" w:pos="4536"/>
+        <w:tab w:val="right" w:pos="9072"/>
+      </w:tabs>
+      <w:spacing w:after="0" w:line="240" w:lineRule="auto"/>
+    </w:pPr>
+  </w:style>
+  <w:style w:type="character" w:customStyle="1" w:styleId="KopfzeileZchn">
+    <w:name w:val="Kopfzeile Zchn"/>
+    <w:basedOn w:val="Absatz-Standardschriftart"/>
+    <w:link w:val="Kopfzeile"/>
+    <w:uiPriority w:val="99"/>
+    <w:rsid w:val="00E93E20"/>
+  </w:style>
+  <w:style w:type="paragraph" w:styleId="Fuzeile">
+    <w:name w:val="footer"/>
+    <w:basedOn w:val="Standard"/>
+    <w:link w:val="FuzeileZchn"/>
+    <w:uiPriority w:val="99"/>
+    <w:unhideWhenUsed/>
+    <w:rsid w:val="00E93E20"/>
+    <w:pPr>
+      <w:tabs>
+        <w:tab w:val="center" w:pos="4536"/>
+        <w:tab w:val="right" w:pos="9072"/>
+      </w:tabs>
+      <w:spacing w:after="0" w:line="240" w:lineRule="auto"/>
+    </w:pPr>
+  </w:style>
+  <w:style w:type="character" w:customStyle="1" w:styleId="FuzeileZchn">
+    <w:name w:val="Fußzeile Zchn"/>
+    <w:basedOn w:val="Absatz-Standardschriftart"/>
+    <w:link w:val="Fuzeile"/>
+    <w:uiPriority w:val="99"/>
+    <w:rsid w:val="00E93E20"/>
+  </w:style>
 </w:styles>
 </file>
 

</xml_diff>